<commit_message>
fill cover letter header and date; regenerate docx/zip
Co-Authored-By: Tatsuki Onishi <bougtoir@gmail.com>
</commit_message>
<xml_diff>
--- a/results/manuscript/smmr_submission/cover_letter_smmr_v1.docx
+++ b/results/manuscript/smmr_submission/cover_letter_smmr_v1.docx
@@ -4,17 +4,32 @@
   <w:body>
     <w:p>
       <w:r>
-        <w:t>[Your name and address]</w:t>
+        <w:t>Onishi Tatsuki</w:t>
       </w:r>
     </w:p>
     <w:p>
       <w:r>
-        <w:t>[Date]</w:t>
+        <w:t>Data Science AI Innovation Research Promotion Center, Shiga University</w:t>
       </w:r>
     </w:p>
     <w:p>
       <w:r>
-        <w:t>Professor [Editor-in-Chief name], Editor-in-Chief</w:t>
+        <w:t>1-1-1 Bamba, Hikone, Shiga 522-8522, Japan</w:t>
+      </w:r>
+    </w:p>
+    <w:p>
+      <w:r>
+        <w:t>bougtoir@gmail.com</w:t>
+      </w:r>
+    </w:p>
+    <w:p>
+      <w:r>
+        <w:t>19 August 2026</w:t>
+      </w:r>
+    </w:p>
+    <w:p>
+      <w:r>
+        <w:t>The Editors</w:t>
       </w:r>
     </w:p>
     <w:p>
@@ -34,7 +49,7 @@
     </w:p>
     <w:p>
       <w:r>
-        <w:t>Dear Professor [Name],</w:t>
+        <w:t>Dear Editors,</w:t>
       </w:r>
     </w:p>
     <w:p>
@@ -211,7 +226,7 @@
     </w:p>
     <w:p>
       <w:r>
-        <w:t>Suggested reviewers: [names and emails to be added].</w:t>
+        <w:t>Suggested reviewers: [To be added: 3–5 names with institutions and email addresses.]</w:t>
       </w:r>
     </w:p>
     <w:p>

</xml_diff>

<commit_message>
remove previous journal submission history from SMMR cover letter and regenerate package
Co-Authored-By: Tatsuki Onishi <bougtoir@gmail.com>
</commit_message>
<xml_diff>
--- a/results/manuscript/smmr_submission/cover_letter_smmr_v1.docx
+++ b/results/manuscript/smmr_submission/cover_letter_smmr_v1.docx
@@ -87,7 +87,7 @@
     </w:p>
     <w:p>
       <w:r>
-        <w:t xml:space="preserve">The manuscript develops and benchmarks descriptive diagnostics for a core medical-statistics problem: hidden effect modification in individual participant data (IPD) meta-analysis. The proposed C1 and W statistics quantify between- and within-stratum treatment-effect heterogeneity, and the simulation systematically compares stratification approaches against established medical-statistics tools (propensity-score stratification, prognostic-score stratification, Gaussian mixture models, outcome-residual stratification and clustering). We therefore believe the work will be of interest to the readership of </w:t>
+        <w:t xml:space="preserve">The manuscript develops and benchmarks descriptive diagnostics for a core medical-statistics problem: hidden effect modification in individual participant data (IPD) meta-analysis. The proposed C1 and W statistics quantify between- and within-stratum treatment-effect heterogeneity, and the simulation systematically compares stratification approaches against established medical-statistics tools, including propensity-score stratification, prognostic-score stratification, Gaussian mixture models, outcome-residual stratification and clustering. We therefore believe the work will be of interest to the readership of </w:t>
       </w:r>
       <w:r>
         <w:rPr>
@@ -105,108 +105,13 @@
         <w:rPr>
           <w:b/>
         </w:rPr>
-        <w:t>Revisions since previous submissions.</w:t>
-      </w:r>
-      <w:r/>
-    </w:p>
-    <w:p>
-      <w:r>
-        <w:t xml:space="preserve">Earlier versions were considered by </w:t>
-      </w:r>
-      <w:r>
-        <w:rPr>
-          <w:i/>
-        </w:rPr>
-        <w:t>BMC Medical Research Methodology</w:t>
-      </w:r>
-      <w:r>
-        <w:t xml:space="preserve">, </w:t>
-      </w:r>
-      <w:r>
-        <w:rPr>
-          <w:i/>
-        </w:rPr>
-        <w:t>Research Synthesis Methods</w:t>
-      </w:r>
-      <w:r>
-        <w:t xml:space="preserve"> and </w:t>
-      </w:r>
-      <w:r>
-        <w:rPr>
-          <w:i/>
-        </w:rPr>
-        <w:t>Biostatistics</w:t>
-      </w:r>
-      <w:r>
-        <w:t>. We have substantially revised the manuscript in response to editorial feedback:</w:t>
-      </w:r>
-    </w:p>
-    <w:p>
-      <w:pPr>
-        <w:pStyle w:val="ListBullet"/>
-      </w:pPr>
-      <w:r>
-        <w:t>Reframed the paper as an exploratory sensitivity study, not a workflow claiming to recover hidden subgroups.</w:t>
-      </w:r>
-    </w:p>
-    <w:p>
-      <w:pPr>
-        <w:pStyle w:val="ListBullet"/>
-      </w:pPr>
-      <w:r>
-        <w:t>Added empirical null distributions and ROC calibration for C1 and W, and reported that discrimination is weak in the primary scenario.</w:t>
-      </w:r>
-    </w:p>
-    <w:p>
-      <w:pPr>
-        <w:pStyle w:val="ListBullet"/>
-      </w:pPr>
-      <w:r>
-        <w:t>Centred C1 and W on their null means to address denominator instability.</w:t>
-      </w:r>
-    </w:p>
-    <w:p>
-      <w:pPr>
-        <w:pStyle w:val="ListBullet"/>
-      </w:pPr>
-      <w:r>
-        <w:t>Added a study-level meta-analysis comparator and discussed the residual floor at n = 10 000.</w:t>
-      </w:r>
-    </w:p>
-    <w:p>
-      <w:pPr>
-        <w:pStyle w:val="ListBullet"/>
-      </w:pPr>
-      <w:r>
-        <w:t>Explicitly separated detection (diagnostic flags) from subgroup recovery (ARI against a constructed true-Z partition).</w:t>
-      </w:r>
-    </w:p>
-    <w:p>
-      <w:pPr>
-        <w:pStyle w:val="ListBullet"/>
-      </w:pPr>
-      <w:r>
-        <w:t>Corrected over-causal language and removed references to earlier versions of the analysis.</w:t>
-      </w:r>
-    </w:p>
-    <w:p>
-      <w:r>
-        <w:t>All numerical results are generated from the repository scripts; the submission package records the exact commit hash and will be archived on Zenodo before acceptance.</w:t>
-      </w:r>
-    </w:p>
-    <w:p>
-      <w:r/>
-      <w:r>
-        <w:rPr>
-          <w:b/>
-        </w:rPr>
         <w:t>Originality and exclusivity.</w:t>
       </w:r>
       <w:r/>
     </w:p>
     <w:p>
       <w:r>
-        <w:t>This manuscript is original and is not under consideration elsewhere. The authors have approved the submission.</w:t>
+        <w:t>This manuscript is original, has not been published previously, and is not under consideration elsewhere. All authors have approved the submission.</w:t>
       </w:r>
     </w:p>
     <w:p>

</xml_diff>